<commit_message>
modified python code to finalize and added word doc
</commit_message>
<xml_diff>
--- a/module-8/gordon_module8_2.docx
+++ b/module-8/gordon_module8_2.docx
@@ -130,11 +130,14 @@
     <w:p/>
     <w:p>
       <w:r>
+        <w:rPr>
+          <w:noProof/>
+        </w:rPr>
         <w:lastRenderedPageBreak/>
         <w:drawing>
-          <wp:inline distT="0" distB="0" distL="0" distR="0" wp14:anchorId="722555B0" wp14:editId="1D553022">
-            <wp:extent cx="3627434" cy="5182049"/>
-            <wp:effectExtent l="0" t="0" r="0" b="0"/>
+          <wp:inline distT="0" distB="0" distL="0" distR="0" wp14:anchorId="722555B0" wp14:editId="35443D3B">
+            <wp:extent cx="5344160" cy="7634514"/>
+            <wp:effectExtent l="0" t="0" r="8890" b="5080"/>
             <wp:docPr id="1892752754" name="Picture 1"/>
             <wp:cNvGraphicFramePr>
               <a:graphicFrameLocks xmlns:a="http://schemas.openxmlformats.org/drawingml/2006/main" noChangeAspect="1"/>
@@ -155,7 +158,7 @@
                   <pic:spPr>
                     <a:xfrm>
                       <a:off x="0" y="0"/>
-                      <a:ext cx="3627434" cy="5182049"/>
+                      <a:ext cx="5349124" cy="7641606"/>
                     </a:xfrm>
                     <a:prstGeom prst="rect">
                       <a:avLst/>
@@ -168,7 +171,85 @@
         </w:drawing>
       </w:r>
     </w:p>
-    <w:p/>
+    <w:p>
+      <w:r>
+        <w:lastRenderedPageBreak/>
+        <w:drawing>
+          <wp:inline distT="0" distB="0" distL="0" distR="0" wp14:anchorId="1376A393" wp14:editId="496DEA76">
+            <wp:extent cx="4961050" cy="2918713"/>
+            <wp:effectExtent l="0" t="0" r="0" b="0"/>
+            <wp:docPr id="1416059733" name="Picture 1"/>
+            <wp:cNvGraphicFramePr>
+              <a:graphicFrameLocks xmlns:a="http://schemas.openxmlformats.org/drawingml/2006/main" noChangeAspect="1"/>
+            </wp:cNvGraphicFramePr>
+            <a:graphic xmlns:a="http://schemas.openxmlformats.org/drawingml/2006/main">
+              <a:graphicData uri="http://schemas.openxmlformats.org/drawingml/2006/picture">
+                <pic:pic xmlns:pic="http://schemas.openxmlformats.org/drawingml/2006/picture">
+                  <pic:nvPicPr>
+                    <pic:cNvPr id="1416059733" name=""/>
+                    <pic:cNvPicPr/>
+                  </pic:nvPicPr>
+                  <pic:blipFill>
+                    <a:blip r:embed="rId5"/>
+                    <a:stretch>
+                      <a:fillRect/>
+                    </a:stretch>
+                  </pic:blipFill>
+                  <pic:spPr>
+                    <a:xfrm>
+                      <a:off x="0" y="0"/>
+                      <a:ext cx="4961050" cy="2918713"/>
+                    </a:xfrm>
+                    <a:prstGeom prst="rect">
+                      <a:avLst/>
+                    </a:prstGeom>
+                  </pic:spPr>
+                </pic:pic>
+              </a:graphicData>
+            </a:graphic>
+          </wp:inline>
+        </w:drawing>
+      </w:r>
+    </w:p>
+    <w:p>
+      <w:r>
+        <w:drawing>
+          <wp:inline distT="0" distB="0" distL="0" distR="0" wp14:anchorId="3C50C041" wp14:editId="10AFBF1B">
+            <wp:extent cx="5943600" cy="975995"/>
+            <wp:effectExtent l="0" t="0" r="0" b="0"/>
+            <wp:docPr id="15010595" name="Picture 1"/>
+            <wp:cNvGraphicFramePr>
+              <a:graphicFrameLocks xmlns:a="http://schemas.openxmlformats.org/drawingml/2006/main" noChangeAspect="1"/>
+            </wp:cNvGraphicFramePr>
+            <a:graphic xmlns:a="http://schemas.openxmlformats.org/drawingml/2006/main">
+              <a:graphicData uri="http://schemas.openxmlformats.org/drawingml/2006/picture">
+                <pic:pic xmlns:pic="http://schemas.openxmlformats.org/drawingml/2006/picture">
+                  <pic:nvPicPr>
+                    <pic:cNvPr id="15010595" name=""/>
+                    <pic:cNvPicPr/>
+                  </pic:nvPicPr>
+                  <pic:blipFill>
+                    <a:blip r:embed="rId6"/>
+                    <a:stretch>
+                      <a:fillRect/>
+                    </a:stretch>
+                  </pic:blipFill>
+                  <pic:spPr>
+                    <a:xfrm>
+                      <a:off x="0" y="0"/>
+                      <a:ext cx="5943600" cy="975995"/>
+                    </a:xfrm>
+                    <a:prstGeom prst="rect">
+                      <a:avLst/>
+                    </a:prstGeom>
+                  </pic:spPr>
+                </pic:pic>
+              </a:graphicData>
+            </a:graphic>
+          </wp:inline>
+        </w:drawing>
+      </w:r>
+    </w:p>
     <w:sectPr>
       <w:pgSz w:w="12240" w:h="15840"/>
       <w:pgMar w:top="1440" w:right="1440" w:bottom="1440" w:left="1440" w:header="720" w:footer="720" w:gutter="0"/>

</xml_diff>

<commit_message>
refactored the python code to give json a cleaner look
</commit_message>
<xml_diff>
--- a/module-8/gordon_module8_2.docx
+++ b/module-8/gordon_module8_2.docx
@@ -173,6 +173,9 @@
     </w:p>
     <w:p>
       <w:r>
+        <w:rPr>
+          <w:noProof/>
+        </w:rPr>
         <w:lastRenderedPageBreak/>
         <w:drawing>
           <wp:inline distT="0" distB="0" distL="0" distR="0" wp14:anchorId="1376A393" wp14:editId="496DEA76">
@@ -214,10 +217,10 @@
     <w:p>
       <w:r>
         <w:drawing>
-          <wp:inline distT="0" distB="0" distL="0" distR="0" wp14:anchorId="3C50C041" wp14:editId="10AFBF1B">
-            <wp:extent cx="5943600" cy="975995"/>
-            <wp:effectExtent l="0" t="0" r="0" b="0"/>
-            <wp:docPr id="15010595" name="Picture 1"/>
+          <wp:inline distT="0" distB="0" distL="0" distR="0" wp14:anchorId="4B8E2325" wp14:editId="535F5F8E">
+            <wp:extent cx="3459480" cy="4966121"/>
+            <wp:effectExtent l="0" t="0" r="7620" b="6350"/>
+            <wp:docPr id="1572901805" name="Picture 1"/>
             <wp:cNvGraphicFramePr>
               <a:graphicFrameLocks xmlns:a="http://schemas.openxmlformats.org/drawingml/2006/main" noChangeAspect="1"/>
             </wp:cNvGraphicFramePr>
@@ -225,7 +228,7 @@
               <a:graphicData uri="http://schemas.openxmlformats.org/drawingml/2006/picture">
                 <pic:pic xmlns:pic="http://schemas.openxmlformats.org/drawingml/2006/picture">
                   <pic:nvPicPr>
-                    <pic:cNvPr id="15010595" name=""/>
+                    <pic:cNvPr id="1572901805" name=""/>
                     <pic:cNvPicPr/>
                   </pic:nvPicPr>
                   <pic:blipFill>
@@ -237,7 +240,7 @@
                   <pic:spPr>
                     <a:xfrm>
                       <a:off x="0" y="0"/>
-                      <a:ext cx="5943600" cy="975995"/>
+                      <a:ext cx="3460991" cy="4968290"/>
                     </a:xfrm>
                     <a:prstGeom prst="rect">
                       <a:avLst/>

</xml_diff>